<commit_message>
Bulk update Word layouts to update broken controls.
 Align the following:
 - Invalid prefix mappings
 - Missing databindings
 - Invalid datastore ids
 - Invalid custom xml mapping
</commit_message>
<xml_diff>
--- a/src/Apps/CZ/AdvancePaymentsLocalization/app/Src/Reports/SalesAdvanceLetterEmail.docx
+++ b/src/Apps/CZ/AdvancePaymentsLocalization/app/Src/Reports/SalesAdvanceLetterEmail.docx
@@ -1953,277 +1953,182 @@
 </a:theme>
 </file>
 
-<file path=customXml/item1.xml>��< ? x m l   v e r s i o n = " 1 . 0 "   e n c o d i n g = " u t f - 1 6 " ? > - 
- < N a v W o r d R e p o r t X m l P a r t   x m l n s = " u r n : m i c r o s o f t - d y n a m i c s - n a v / r e p o r t s / S a l e s _ A d v a n c e _ L e t t e r _ C Z Z / 3 1 0 1 4 / " > - 
-     < B C R e p o r t I n f o r m a t i o n > - 
-         < R e p o r t M e t a d a t a > - 
-             < E x t e n s i o n I d > E x t e n s i o n   I D < / E x t e n s i o n I d > - 
-             < E x t e n s i o n N a m e > E x t e n s i o n   N a m e < / E x t e n s i o n N a m e > - 
-             < E x t e n s i o n P u b l i s h e r > E x t e n s i o n   P u b l i s h e r < / E x t e n s i o n P u b l i s h e r > - 
-             < E x t e n s i o n V e r s i o n > E x t e n s i o n   V e r s i o n < / E x t e n s i o n V e r s i o n > - 
-             < R e p o r t I d > R e p o r t   I D < / R e p o r t I d > - 
-             < R e p o r t N a m e > R e p o r t   N a m e < / R e p o r t N a m e > - 
-             < A b o u t T h i s R e p o r t T i t l e > A b o u t   T h i s   R e p o r t   T i t l e < / A b o u t T h i s R e p o r t T i t l e > - 
-             < A b o u t T h i s R e p o r t T e x t > A b o u t   T h i s   R e p o r t   T e x t < / A b o u t T h i s R e p o r t T e x t > - 
-             < R e p o r t H e l p L i n k > R e p o r t   H e l p   L i n k < / R e p o r t H e l p L i n k > - 
-         < / R e p o r t M e t a d a t a > - 
-         < R e p o r t R e q u e s t > - 
-             < T e n a n t E n t r a I d > T e n a n t   E n t r a   I d < / T e n a n t E n t r a I d > - 
-             < E n v i r o n m e n t N a m e > E n v i r o n m e n t   N a m e < / E n v i r o n m e n t N a m e > - 
-             < E n v i r o n m e n t T y p e > E n v i r o n m e n t   T y p e < / E n v i r o n m e n t T y p e > - 
-             < C o m p a n y N a m e > C o m p a n y   N a m e < / C o m p a n y N a m e > - 
-             < C o m p a n y D i s p l a y N a m e > C o m p a n y   D i s p l a y   N a m e < / C o m p a n y D i s p l a y N a m e > - 
-             < C o m p a n y I d > C o m p a n y   I D < / C o m p a n y I d > - 
-             < U s e r N a m e > U s e r   N a m e < / U s e r N a m e > - 
-             < D a t e A n d T i m e > D a t e   a n d   T i m e < / D a t e A n d T i m e > - 
-             < L a n g u a g e > L a n g u a g e < / L a n g u a g e > - 
-             < F o r m a t R e g i o n > F o r m a t   R e g i o n < / F o r m a t R e g i o n > - 
-             < D a t e T i m e V a l u e s > - 
-                 < Y e a r > Y e a r < / Y e a r > - 
-                 < M o n t h N u m b e r > M o n t h   N u m b e r < / M o n t h N u m b e r > - 
-                 < D a y N u m b e r > D a y   N u m b e r < / D a y N u m b e r > - 
-                 < H o u r > H o u r < / H o u r > - 
-                 < M i n u t e > M i n u t e < / M i n u t e > - 
-             < / D a t e T i m e V a l u e s > - 
-         < / R e p o r t R e q u e s t > - 
-     < / B C R e p o r t I n f o r m a t i o n > - 
-     < C o m p a n y _ I n f o r m a t i o n > - 
-         < C o m p a n y A d d r 1 > C o m p a n y A d d r 1 < / C o m p a n y A d d r 1 > - 
-         < C o m p a n y A d d r 2 > C o m p a n y A d d r 2 < / C o m p a n y A d d r 2 > - 
-         < C o m p a n y A d d r 3 > C o m p a n y A d d r 3 < / C o m p a n y A d d r 3 > - 
-         < C o m p a n y A d d r 4 > C o m p a n y A d d r 4 < / C o m p a n y A d d r 4 > - 
-         < C o m p a n y A d d r 5 > C o m p a n y A d d r 5 < / C o m p a n y A d d r 5 > - 
-         < C o m p a n y A d d r 6 > C o m p a n y A d d r 6 < / C o m p a n y A d d r 6 > - 
-         < H o m e P a g e _ C o m p a n y I n f o r m a t i o n > H o m e P a g e _ C o m p a n y I n f o r m a t i o n < / H o m e P a g e _ C o m p a n y I n f o r m a t i o n > - 
-         < P i c t u r e _ C o m p a n y I n f o r m a t i o n   / > - 
-         < R e g i s t r a t i o n N o _ C o m p a n y I n f o r m a t i o n > R e g i s t r a t i o n N o _ C o m p a n y I n f o r m a t i o n < / R e g i s t r a t i o n N o _ C o m p a n y I n f o r m a t i o n > - 
-         < V A T R e g i s t r a t i o n N o _ C o m p a n y I n f o r m a t i o n > V A T R e g i s t r a t i o n N o _ C o m p a n y I n f o r m a t i o n < / V A T R e g i s t r a t i o n N o _ C o m p a n y I n f o r m a t i o n > - 
-         < S a l e s _ _ x 0 0 2 6 _ _ R e c e i v a b l e s _ S e t u p > - 
-             < L o g o P o s i t i o n o n D o c u m e n t s _ S a l e s R e c e i v a b l e s S e t u p > L o g o P o s i t i o n o n D o c u m e n t s _ S a l e s R e c e i v a b l e s S e t u p < / L o g o P o s i t i o n o n D o c u m e n t s _ S a l e s R e c e i v a b l e s S e t u p > - 
-             < G e n e r a l _ L e d g e r _ S e t u p > - 
-                 < L C Y C o d e _ G e n e r a l L e d g e r S e t u p > L C Y C o d e _ G e n e r a l L e d g e r S e t u p < / L C Y C o d e _ G e n e r a l L e d g e r S e t u p > - 
-             < / G e n e r a l _ L e d g e r _ S e t u p > - 
-         < / S a l e s _ _ x 0 0 2 6 _ _ R e c e i v a b l e s _ S e t u p > - 
-     < / C o m p a n y _ I n f o r m a t i o n > - 
-     < S a l e s _ A d v a n c e _ L e t t e r _ H e a d e r > - 
-         < A d v a n c e D u e D a t e _ S a l e s A d v a n c L e t t e r H e a d e r > A d v a n c e D u e D a t e _ S a l e s A d v a n c L e t t e r H e a d e r < / A d v a n c e D u e D a t e _ S a l e s A d v a n c L e t t e r H e a d e r > - 
-         < A d v a n c e D u e D a t e _ S a l e s A d v a n c L e t t e r H e a d e r C a p t i o n > A d v a n c e D u e D a t e _ S a l e s A d v a n c L e t t e r H e a d e r C a p t i o n < / A d v a n c e D u e D a t e _ S a l e s A d v a n c L e t t e r H e a d e r C a p t i o n > - 
-         < A m o u n t I n c l u d i n g V A T > A m o u n t I n c l u d i n g V A T < / A m o u n t I n c l u d i n g V A T > - 
-         < A m o u n t I n c l u d i n g V A T L b l > A m o u n t I n c l u d i n g V A T L b l < / A m o u n t I n c l u d i n g V A T L b l > - 
-         < B a n k A c c o u n t N o _ S a l e s A d v a n c e L e t t e r H e a d e r > B a n k A c c o u n t N o _ S a l e s A d v a n c e L e t t e r H e a d e r < / B a n k A c c o u n t N o _ S a l e s A d v a n c e L e t t e r H e a d e r > - 
-         < B a n k A c c o u n t N o _ S a l e s A d v a n c e L e t t e r H e a d e r C a p t i o n > B a n k A c c o u n t N o _ S a l e s A d v a n c e L e t t e r H e a d e r C a p t i o n < / B a n k A c c o u n t N o _ S a l e s A d v a n c e L e t t e r H e a d e r C a p t i o n > - 
-         < B I C _ S a l e s A d v a n c e L e t t e r H e a d e r > B I C _ S a l e s A d v a n c e L e t t e r H e a d e r < / B I C _ S a l e s A d v a n c e L e t t e r H e a d e r > - 
-         < B I C _ S a l e s A d v a n c e L e t t e r H e a d e r C a p t i o n > B I C _ S a l e s A d v a n c e L e t t e r H e a d e r C a p t i o n < / B I C _ S a l e s A d v a n c e L e t t e r H e a d e r C a p t i o n > - 
-         < B o d y L b l > B o d y L b l < / B o d y L b l > - 
-         < C l o s i n g L b l > C l o s i n g L b l < / C l o s i n g L b l > - 
-         < C o m p a n y A d d r e s s 1 > C o m p a n y A d d r e s s 1 < / C o m p a n y A d d r e s s 1 > - 
-         < C o m p a n y A d d r e s s 2 > C o m p a n y A d d r e s s 2 < / C o m p a n y A d d r e s s 2 > - 
-         < C o m p a n y A d d r e s s 3 > C o m p a n y A d d r e s s 3 < / C o m p a n y A d d r e s s 3 > - 
-         < C o m p a n y A d d r e s s 4 > C o m p a n y A d d r e s s 4 < / C o m p a n y A d d r e s s 4 > - 
-         < C o m p a n y A d d r e s s 5 > C o m p a n y A d d r e s s 5 < / C o m p a n y A d d r e s s 5 > - 
-         < C o m p a n y A d d r e s s 6 > C o m p a n y A d d r e s s 6 < / C o m p a n y A d d r e s s 6 > - 
-         < C o p y L b l > C o p y L b l < / C o p y L b l > - 
-         < C r e a t o r L b l > C r e a t o r L b l < / C r e a t o r L b l > - 
-         < C u r r e n c y C o d e _ S a l e s A d v a n c e L e t t e r H e a d e r > C u r r e n c y C o d e _ S a l e s A d v a n c e L e t t e r H e a d e r < / C u r r e n c y C o d e _ S a l e s A d v a n c e L e t t e r H e a d e r > - 
-         < C u s t A d d r 1 > C u s t A d d r 1 < / C u s t A d d r 1 > - 
-         < C u s t A d d r 2 > C u s t A d d r 2 < / C u s t A d d r 2 > - 
-         < C u s t A d d r 3 > C u s t A d d r 3 < / C u s t A d d r 3 > - 
-         < C u s t A d d r 4 > C u s t A d d r 4 < / C u s t A d d r 4 > - 
-         < C u s t A d d r 5 > C u s t A d d r 5 < / C u s t A d d r 5 > - 
-         < C u s t A d d r 6 > C u s t A d d r 6 < / C u s t A d d r 6 > - 
-         < C u s t L b l > C u s t L b l < / C u s t L b l > - 
-         < D o c F o o t e r T e x t > D o c F o o t e r T e x t < / D o c F o o t e r T e x t > - 
-         < D o c u m e n t D a t e _ S a l e s A d v a n c e L e t t e r H e a d e r > D o c u m e n t D a t e _ S a l e s A d v a n c e L e t t e r H e a d e r < / D o c u m e n t D a t e _ S a l e s A d v a n c e L e t t e r H e a d e r > - 
-         < D o c u m e n t D a t e _ S a l e s A d v a n c e L e t t e r H e a d e r C a p t i o n > D o c u m e n t D a t e _ S a l e s A d v a n c e L e t t e r H e a d e r C a p t i o n < / D o c u m e n t D a t e _ S a l e s A d v a n c e L e t t e r H e a d e r C a p t i o n > - 
-         < D o c u m e n t L b l > D o c u m e n t L b l < / D o c u m e n t L b l > - 
-         < D o c u m e n t N o L b l > D o c u m e n t N o L b l < / D o c u m e n t N o L b l > - 
-         < F o r m a t t e d _ A m o u n t I n c l u d i n g V A T > F o r m a t t e d _ A m o u n t I n c l u d i n g V A T < / F o r m a t t e d _ A m o u n t I n c l u d i n g V A T > - 
-         < G r e e t i n g L b l > G r e e t i n g L b l < / G r e e t i n g L b l > - 
-         < I B A N _ S a l e s A d v a n c e L e t t e r H e a d e r > I B A N _ S a l e s A d v a n c e L e t t e r H e a d e r < / I B A N _ S a l e s A d v a n c e L e t t e r H e a d e r > - 
-         < I B A N _ S a l e s A d v a n c e L e t t e r H e a d e r C a p t i o n > I B A N _ S a l e s A d v a n c e L e t t e r H e a d e r C a p t i o n < / I B A N _ S a l e s A d v a n c e L e t t e r H e a d e r C a p t i o n > - 
-         < N o _ S a l e s A d v a n c e L e t t e r H e a d e r > N o _ S a l e s A d v a n c e L e t t e r H e a d e r < / N o _ S a l e s A d v a n c e L e t t e r H e a d e r > - 
-         < P a g e L b l > P a g e L b l < / P a g e L b l > - 
-         < P a y m e n t M e t h o d > P a y m e n t M e t h o d < / P a y m e n t M e t h o d > - 
-         < P a y m e n t M e t h o d L b l > P a y m e n t M e t h o d L b l < / P a y m e n t M e t h o d L b l > - 
-         < P a y m e n t T e r m s > P a y m e n t T e r m s < / P a y m e n t T e r m s > - 
-         < P a y m e n t T e r m s L b l > P a y m e n t T e r m s L b l < / P a y m e n t T e r m s L b l > - 
-         < P m n t S y m b o l 1 > P m n t S y m b o l 1 < / P m n t S y m b o l 1 > - 
-         < P m n t S y m b o l 2 > P m n t S y m b o l 2 < / P m n t S y m b o l 2 > - 
-         < P m n t S y m b o l 3 > P m n t S y m b o l 3 < / P m n t S y m b o l 3 > - 
-         < P m n t S y m b o l 4 > P m n t S y m b o l 4 < / P m n t S y m b o l 4 > - 
-         < Q R P a y m e n t C o d e > Q R P a y m e n t C o d e < / Q R P a y m e n t C o d e > - 
-         < Q R P a y m e n t L b l > Q R P a y m e n t L b l < / Q R P a y m e n t L b l > - 
-         < R e g i s t r a t i o n N o _ S a l e s A d v a n c e L e t t e r H e a d e r > R e g i s t r a t i o n N o _ S a l e s A d v a n c e L e t t e r H e a d e r < / R e g i s t r a t i o n N o _ S a l e s A d v a n c e L e t t e r H e a d e r > - 
-         < R e g i s t r a t i o n N o _ S a l e s A d v a n c e L e t t e r H e a d e r C a p t i o n > R e g i s t r a t i o n N o _ S a l e s A d v a n c e L e t t e r H e a d e r C a p t i o n < / R e g i s t r a t i o n N o _ S a l e s A d v a n c e L e t t e r H e a d e r C a p t i o n > - 
-         < S a l e s p e r s o n L b l > S a l e s p e r s o n L b l < / S a l e s p e r s o n L b l > - 
-         < T o t a l L b l > T o t a l L b l < / T o t a l L b l > - 
-         < V A T R e g i s t r a t i o n N o _ S a l e s A d v a n c e L e t t e r H e a d e r > V A T R e g i s t r a t i o n N o _ S a l e s A d v a n c e L e t t e r H e a d e r < / V A T R e g i s t r a t i o n N o _ S a l e s A d v a n c e L e t t e r H e a d e r > - 
-         < V A T R e g i s t r a t i o n N o _ S a l e s A d v a n c e L e t t e r H e a d e r C a p t i o n > V A T R e g i s t r a t i o n N o _ S a l e s A d v a n c e L e t t e r H e a d e r C a p t i o n < / V A T R e g i s t r a t i o n N o _ S a l e s A d v a n c e L e t t e r H e a d e r C a p t i o n > - 
-         < V e n d L b l > V e n d L b l < / V e n d L b l > - 
-         < Y o u r R e f e r e n c e _ S a l e s A d v a n c e L e t t e r H e a d e r > Y o u r R e f e r e n c e _ S a l e s A d v a n c e L e t t e r H e a d e r < / Y o u r R e f e r e n c e _ S a l e s A d v a n c e L e t t e r H e a d e r > - 
-         < Y o u r R e f e r e n c e _ S a l e s A d v a n c e L e t t e r H e a d e r C a p t i o n > Y o u r R e f e r e n c e _ S a l e s A d v a n c e L e t t e r H e a d e r C a p t i o n < / Y o u r R e f e r e n c e _ S a l e s A d v a n c e L e t t e r H e a d e r C a p t i o n > - 
-         < C o p y L o o p > - 
-             < C o p y N o > C o p y N o < / C o p y N o > - 
-             < S a l e s p e r s o n _ P u r c h a s e r > - 
-                 < E M a i l _ S a l e s p e r s o n P u r c h a s e r > E M a i l _ S a l e s p e r s o n P u r c h a s e r < / E M a i l _ S a l e s p e r s o n P u r c h a s e r > - 
-                 < N a m e _ S a l e s p e r s o n P u r c h a s e r > N a m e _ S a l e s p e r s o n P u r c h a s e r < / N a m e _ S a l e s p e r s o n P u r c h a s e r > - 
-                 < P h o n e N o _ S a l e s p e r s o n P u r c h a s e r > P h o n e N o _ S a l e s p e r s o n P u r c h a s e r < / P h o n e N o _ S a l e s p e r s o n P u r c h a s e r > - 
-             < / S a l e s p e r s o n _ P u r c h a s e r > - 
-             < S a l e s _ A d v a n c e _ L e t t e r _ L i n e > - 
-                 < A m o u n t I n c l u d i n g V A T _ S a l e s A d v a n c e L e t t e r L i n e > A m o u n t I n c l u d i n g V A T _ S a l e s A d v a n c e L e t t e r L i n e < / A m o u n t I n c l u d i n g V A T _ S a l e s A d v a n c e L e t t e r L i n e > - 
-                 < A m o u n t I n c l u d i n g V A T _ S a l e s A d v a n c e L e t t e r L i n e C a p t i o n > A m o u n t I n c l u d i n g V A T _ S a l e s A d v a n c e L e t t e r L i n e C a p t i o n < / A m o u n t I n c l u d i n g V A T _ S a l e s A d v a n c e L e t t e r L i n e C a p t i o n > - 
-                 < D e s c r i p t i o n _ S a l e s A d v a n c e L e t t e r L i n e > D e s c r i p t i o n _ S a l e s A d v a n c e L e t t e r L i n e < / D e s c r i p t i o n _ S a l e s A d v a n c e L e t t e r L i n e > - 
-                 < D e s c r i p t i o n _ S a l e s A d v a n c e L e t t e r L i n e C a p t i o n > D e s c r i p t i o n _ S a l e s A d v a n c e L e t t e r L i n e C a p t i o n < / D e s c r i p t i o n _ S a l e s A d v a n c e L e t t e r L i n e C a p t i o n > - 
-                 < F o r m a t t e d _ A m o u n t I n c l u d i n g V A T _ S a l e s A d v a n c e L e t t e r L i n e > F o r m a t t e d _ A m o u n t I n c l u d i n g V A T _ S a l e s A d v a n c e L e t t e r L i n e < / F o r m a t t e d _ A m o u n t I n c l u d i n g V A T _ S a l e s A d v a n c e L e t t e r L i n e > - 
-                 < L i n e N o _ S a l e s A d v a n c e L e t t e r L i n e > L i n e N o _ S a l e s A d v a n c e L e t t e r L i n e < / L i n e N o _ S a l e s A d v a n c e L e t t e r L i n e > - 
-                 < V A T _ S a l e s A d v a n c e L e t t e r L i n e > V A T _ S a l e s A d v a n c e L e t t e r L i n e < / V A T _ S a l e s A d v a n c e L e t t e r L i n e > - 
-                 < V A T _ S a l e s A d v a n c e L e t t e r L i n e C a p t i o n > V A T _ S a l e s A d v a n c e L e t t e r L i n e C a p t i o n < / V A T _ S a l e s A d v a n c e L e t t e r L i n e C a p t i o n > - 
-             < / S a l e s _ A d v a n c e _ L e t t e r _ L i n e > - 
-             < U s e r _ S e t u p > - 
-                 < E m p l o y e e > - 
-                     < C o m p a n y E M a i l _ E m p l o y e e > C o m p a n y E M a i l _ E m p l o y e e < / C o m p a n y E M a i l _ E m p l o y e e > - 
-                     < F u l l N a m e _ E m p l o y e e > F u l l N a m e _ E m p l o y e e < / F u l l N a m e _ E m p l o y e e > - 
-                     < P h o n e N o _ E m p l o y e e > P h o n e N o _ E m p l o y e e < / P h o n e N o _ E m p l o y e e > - 
-                 < / E m p l o y e e > - 
-             < / U s e r _ S e t u p > - 
-         < / C o p y L o o p > - 
-     < / S a l e s _ A d v a n c e _ L e t t e r _ H e a d e r > - 
- < / N a v W o r d R e p o r t X m l P a r t > 
+<file path=customXml/item1.xml><?xml version="1.0" encoding="utf-8"?>
+<NavWordReportXmlPart xmlns="urn:microsoft-dynamics-nav/reports/Sales_Advance_Letter_CZZ/31014/">
+  <BCReportInformation>
+    <ReportMetadata>
+      <ExtensionId>Extension ID</ExtensionId>
+      <ExtensionName>Extension Name</ExtensionName>
+      <ExtensionPublisher>Extension Publisher</ExtensionPublisher>
+      <ExtensionVersion>Extension Version</ExtensionVersion>
+      <ReportId>Report ID</ReportId>
+      <ReportName>Report Name</ReportName>
+      <AboutThisReportTitle>About This Report Title</AboutThisReportTitle>
+      <AboutThisReportText>About This Report Text</AboutThisReportText>
+      <ReportHelpLink>Report Help Link</ReportHelpLink>
+      <ReportCaption>Report Caption</ReportCaption>
+    </ReportMetadata>
+    <ReportRequest>
+      <TenantEntraId>Tenant Entra Id</TenantEntraId>
+      <EnvironmentName>Environment Name</EnvironmentName>
+      <EnvironmentType>Environment Type</EnvironmentType>
+      <CompanyName>Company Name</CompanyName>
+      <CompanyDisplayName>Company Display Name</CompanyDisplayName>
+      <CompanyId>Company ID</CompanyId>
+      <UserName>User Name</UserName>
+      <DateAndTime>Date and Time</DateAndTime>
+      <Language>Language</Language>
+      <FormatRegion>Format Region</FormatRegion>
+      <DateTimeValues>
+        <Year>Year</Year>
+        <MonthNumber>Month Number</MonthNumber>
+        <DayNumber>Day Number</DayNumber>
+        <Hour>Hour</Hour>
+        <Minute>Minute</Minute>
+      </DateTimeValues>
+    </ReportRequest>
+    <CompanyMetadata>
+      <CompanyName>Company Name</CompanyName>
+      <CompanyDisplayName>Company Display Name</CompanyDisplayName>
+      <CompanyAddressLines>
+        <CompanyAddressLine1>Company Address Line 1</CompanyAddressLine1>
+        <CompanyAddressLine2>Company Address Line 2</CompanyAddressLine2>
+        <CompanyAddressLine3>Company Address Line 3</CompanyAddressLine3>
+        <CompanyAddressLine4>Company Address Line 4</CompanyAddressLine4>
+        <CompanyAddressLine5>Company Address Line 5</CompanyAddressLine5>
+        <CompanyAddressLine6>Company Address Line 6</CompanyAddressLine6>
+        <CompanyAddressLine7>Company Address Line 7</CompanyAddressLine7>
+        <CompanyAddressLine8>Company Address Line 8</CompanyAddressLine8>
+      </CompanyAddressLines>
+      <CompanyPhone>Company Phone</CompanyPhone>
+      <CompanyPhoneCaption>Company Phone Caption</CompanyPhoneCaption>
+      <CompanyFaxNo>Company Fax No.</CompanyFaxNo>
+      <CompanyFaxNoCaption>Company Fax No. Caption</CompanyFaxNoCaption>
+      <CompanyEmail>Company Email</CompanyEmail>
+      <CompanyEmailCaption>Company Email Caption</CompanyEmailCaption>
+      <CompanyHomePage>Company Home Page</CompanyHomePage>
+      <CompanyHomePageCaption>Company Home Page Caption</CompanyHomePageCaption>
+      <CompanyLogo>Company Logo</CompanyLogo>
+      <CompanyVATRegistrationNo>Company VAT Registration No.</CompanyVATRegistrationNo>
+      <CompanyVATRegistrationNoCaption>Company VAT Registration No. Caption</CompanyVATRegistrationNoCaption>
+      <CompanyRegistrationNo>Company Registration No.</CompanyRegistrationNo>
+      <CompanyRegistrationNoCaption>Company Registration No. Caption</CompanyRegistrationNoCaption>
+      <CompanyBankName>Company Bank Name</CompanyBankName>
+      <CompanyBankNameCaption>Company Bank Name Caption</CompanyBankNameCaption>
+      <CompanyBankAccountNo>Company Bank Account No.</CompanyBankAccountNo>
+      <CompanyBankAccountNoCaption>Company Bank Account No. Caption</CompanyBankAccountNoCaption>
+      <CompanyBankBranchNo>Company Bank Branch No.</CompanyBankBranchNo>
+      <CompanyBankBranchNoCaption>Company Bank Branch No. Caption</CompanyBankBranchNoCaption>
+      <CompanyIBAN>Company IBAN</CompanyIBAN>
+      <CompanyIBANCaption>Company IBAN Caption</CompanyIBANCaption>
+      <CompanyBankSWIFT>Company Bank SWIFT</CompanyBankSWIFT>
+      <CompanyBankSWIFTCaption>Company Bank SWIFT Caption</CompanyBankSWIFTCaption>
+      <CompanyGiroNo>Company Giro No.</CompanyGiroNo>
+      <CompanyGiroNoCaption>Company Giro No. Caption</CompanyGiroNoCaption>
+    </CompanyMetadata>
+  </BCReportInformation>
+  <Company_Information>
+    <CompanyAddr1>CompanyAddr1</CompanyAddr1>
+    <CompanyAddr2>CompanyAddr2</CompanyAddr2>
+    <CompanyAddr3>CompanyAddr3</CompanyAddr3>
+    <CompanyAddr4>CompanyAddr4</CompanyAddr4>
+    <CompanyAddr5>CompanyAddr5</CompanyAddr5>
+    <CompanyAddr6>CompanyAddr6</CompanyAddr6>
+    <HomePage_CompanyInformation>HomePage_CompanyInformation</HomePage_CompanyInformation>
+    <Picture_CompanyInformation/>
+    <RegistrationNo_CompanyInformation>RegistrationNo_CompanyInformation</RegistrationNo_CompanyInformation>
+    <VATRegistrationNo_CompanyInformation>VATRegistrationNo_CompanyInformation</VATRegistrationNo_CompanyInformation>
+    <Sales__x0026__Receivables_Setup>
+      <LogoPositiononDocuments_SalesReceivablesSetup>LogoPositiononDocuments_SalesReceivablesSetup</LogoPositiononDocuments_SalesReceivablesSetup>
+      <General_Ledger_Setup>
+        <LCYCode_GeneralLedgerSetup>LCYCode_GeneralLedgerSetup</LCYCode_GeneralLedgerSetup>
+      </General_Ledger_Setup>
+    </Sales__x0026__Receivables_Setup>
+  </Company_Information>
+  <Sales_Advance_Letter_Header>
+    <AdvanceDueDate_SalesAdvancLetterHeader>AdvanceDueDate_SalesAdvancLetterHeader</AdvanceDueDate_SalesAdvancLetterHeader>
+    <AdvanceDueDate_SalesAdvancLetterHeaderCaption>AdvanceDueDate_SalesAdvancLetterHeaderCaption</AdvanceDueDate_SalesAdvancLetterHeaderCaption>
+    <AmountIncludingVAT>AmountIncludingVAT</AmountIncludingVAT>
+    <AmountIncludingVATLbl>AmountIncludingVATLbl</AmountIncludingVATLbl>
+    <BankAccountNo_SalesAdvanceLetterHeader>BankAccountNo_SalesAdvanceLetterHeader</BankAccountNo_SalesAdvanceLetterHeader>
+    <BankAccountNo_SalesAdvanceLetterHeaderCaption>BankAccountNo_SalesAdvanceLetterHeaderCaption</BankAccountNo_SalesAdvanceLetterHeaderCaption>
+    <BIC_SalesAdvanceLetterHeader>BIC_SalesAdvanceLetterHeader</BIC_SalesAdvanceLetterHeader>
+    <BIC_SalesAdvanceLetterHeaderCaption>BIC_SalesAdvanceLetterHeaderCaption</BIC_SalesAdvanceLetterHeaderCaption>
+    <BodyLbl>BodyLbl</BodyLbl>
+    <ClosingLbl>ClosingLbl</ClosingLbl>
+    <CompanyAddress1>CompanyAddress1</CompanyAddress1>
+    <CompanyAddress2>CompanyAddress2</CompanyAddress2>
+    <CompanyAddress3>CompanyAddress3</CompanyAddress3>
+    <CompanyAddress4>CompanyAddress4</CompanyAddress4>
+    <CompanyAddress5>CompanyAddress5</CompanyAddress5>
+    <CompanyAddress6>CompanyAddress6</CompanyAddress6>
+    <CopyLbl>CopyLbl</CopyLbl>
+    <CreatorLbl>CreatorLbl</CreatorLbl>
+    <CurrencyCode_SalesAdvanceLetterHeader>CurrencyCode_SalesAdvanceLetterHeader</CurrencyCode_SalesAdvanceLetterHeader>
+    <CustAddr1>CustAddr1</CustAddr1>
+    <CustAddr2>CustAddr2</CustAddr2>
+    <CustAddr3>CustAddr3</CustAddr3>
+    <CustAddr4>CustAddr4</CustAddr4>
+    <CustAddr5>CustAddr5</CustAddr5>
+    <CustAddr6>CustAddr6</CustAddr6>
+    <CustLbl>CustLbl</CustLbl>
+    <DocFooterText>DocFooterText</DocFooterText>
+    <DocumentDate_SalesAdvanceLetterHeader>DocumentDate_SalesAdvanceLetterHeader</DocumentDate_SalesAdvanceLetterHeader>
+    <DocumentDate_SalesAdvanceLetterHeaderCaption>DocumentDate_SalesAdvanceLetterHeaderCaption</DocumentDate_SalesAdvanceLetterHeaderCaption>
+    <DocumentLbl>DocumentLbl</DocumentLbl>
+    <DocumentNoLbl>DocumentNoLbl</DocumentNoLbl>
+    <Formatted_AmountIncludingVAT>Formatted_AmountIncludingVAT</Formatted_AmountIncludingVAT>
+    <GreetingLbl>GreetingLbl</GreetingLbl>
+    <IBAN_SalesAdvanceLetterHeader>IBAN_SalesAdvanceLetterHeader</IBAN_SalesAdvanceLetterHeader>
+    <IBAN_SalesAdvanceLetterHeaderCaption>IBAN_SalesAdvanceLetterHeaderCaption</IBAN_SalesAdvanceLetterHeaderCaption>
+    <No_SalesAdvanceLetterHeader>No_SalesAdvanceLetterHeader</No_SalesAdvanceLetterHeader>
+    <PageLbl>PageLbl</PageLbl>
+    <PaymentMethod>PaymentMethod</PaymentMethod>
+    <PaymentMethodLbl>PaymentMethodLbl</PaymentMethodLbl>
+    <PaymentTerms>PaymentTerms</PaymentTerms>
+    <PaymentTermsLbl>PaymentTermsLbl</PaymentTermsLbl>
+    <PmntSymbol1>PmntSymbol1</PmntSymbol1>
+    <PmntSymbol2>PmntSymbol2</PmntSymbol2>
+    <PmntSymbol3>PmntSymbol3</PmntSymbol3>
+    <PmntSymbol4>PmntSymbol4</PmntSymbol4>
+    <QRPaymentCode>QRPaymentCode</QRPaymentCode>
+    <QRPaymentLbl>QRPaymentLbl</QRPaymentLbl>
+    <RegistrationNo_SalesAdvanceLetterHeader>RegistrationNo_SalesAdvanceLetterHeader</RegistrationNo_SalesAdvanceLetterHeader>
+    <RegistrationNo_SalesAdvanceLetterHeaderCaption>RegistrationNo_SalesAdvanceLetterHeaderCaption</RegistrationNo_SalesAdvanceLetterHeaderCaption>
+    <SalespersonLbl>SalespersonLbl</SalespersonLbl>
+    <TotalLbl>TotalLbl</TotalLbl>
+    <VATRegistrationNo_SalesAdvanceLetterHeader>VATRegistrationNo_SalesAdvanceLetterHeader</VATRegistrationNo_SalesAdvanceLetterHeader>
+    <VATRegistrationNo_SalesAdvanceLetterHeaderCaption>VATRegistrationNo_SalesAdvanceLetterHeaderCaption</VATRegistrationNo_SalesAdvanceLetterHeaderCaption>
+    <VendLbl>VendLbl</VendLbl>
+    <YourReference_SalesAdvanceLetterHeader>YourReference_SalesAdvanceLetterHeader</YourReference_SalesAdvanceLetterHeader>
+    <YourReference_SalesAdvanceLetterHeaderCaption>YourReference_SalesAdvanceLetterHeaderCaption</YourReference_SalesAdvanceLetterHeaderCaption>
+    <CopyLoop>
+      <CopyNo>CopyNo</CopyNo>
+      <Salesperson_Purchaser>
+        <EMail_SalespersonPurchaser>EMail_SalespersonPurchaser</EMail_SalespersonPurchaser>
+        <Name_SalespersonPurchaser>Name_SalespersonPurchaser</Name_SalespersonPurchaser>
+        <PhoneNo_SalespersonPurchaser>PhoneNo_SalespersonPurchaser</PhoneNo_SalespersonPurchaser>
+      </Salesperson_Purchaser>
+      <Sales_Advance_Letter_Line>
+        <AmountIncludingVAT_SalesAdvanceLetterLine>AmountIncludingVAT_SalesAdvanceLetterLine</AmountIncludingVAT_SalesAdvanceLetterLine>
+        <AmountIncludingVAT_SalesAdvanceLetterLineCaption>AmountIncludingVAT_SalesAdvanceLetterLineCaption</AmountIncludingVAT_SalesAdvanceLetterLineCaption>
+        <Description_SalesAdvanceLetterLine>Description_SalesAdvanceLetterLine</Description_SalesAdvanceLetterLine>
+        <Description_SalesAdvanceLetterLineCaption>Description_SalesAdvanceLetterLineCaption</Description_SalesAdvanceLetterLineCaption>
+        <Formatted_AmountIncludingVAT_SalesAdvanceLetterLine>Formatted_AmountIncludingVAT_SalesAdvanceLetterLine</Formatted_AmountIncludingVAT_SalesAdvanceLetterLine>
+        <LineNo_SalesAdvanceLetterLine>LineNo_SalesAdvanceLetterLine</LineNo_SalesAdvanceLetterLine>
+        <VAT_SalesAdvanceLetterLine>VAT_SalesAdvanceLetterLine</VAT_SalesAdvanceLetterLine>
+        <VAT_SalesAdvanceLetterLineCaption>VAT_SalesAdvanceLetterLineCaption</VAT_SalesAdvanceLetterLineCaption>
+      </Sales_Advance_Letter_Line>
+      <User_Setup>
+        <Employee>
+          <CompanyEMail_Employee>CompanyEMail_Employee</CompanyEMail_Employee>
+          <FullName_Employee>FullName_Employee</FullName_Employee>
+          <PhoneNo_Employee>PhoneNo_Employee</PhoneNo_Employee>
+        </Employee>
+      </User_Setup>
+    </CopyLoop>
+  </Sales_Advance_Letter_Header>
+</NavWordReportXmlPart>
 </file>
 
 <file path=customXml/item2.xml>��< ? x m l   v e r s i o n = " 1 . 0 "   e n c o d i n g = " u t f - 1 6 " ? > 
</xml_diff>

<commit_message>
Bulk update Word layouts to update broken controls.  Align the following:  - Invalid prefix mappings  - Missing databindings  - Invalid datastore ids  - Invalid custom xml mapping
</commit_message>
<xml_diff>
--- a/src/Apps/CZ/AdvancePaymentsLocalization/app/Src/Reports/SalesAdvanceLetterEmail.docx
+++ b/src/Apps/CZ/AdvancePaymentsLocalization/app/Src/Reports/SalesAdvanceLetterEmail.docx
@@ -1953,277 +1953,182 @@
 </a:theme>
 </file>
 
-<file path=customXml/item1.xml>��< ? x m l   v e r s i o n = " 1 . 0 "   e n c o d i n g = " u t f - 1 6 " ? > - 
- < N a v W o r d R e p o r t X m l P a r t   x m l n s = " u r n : m i c r o s o f t - d y n a m i c s - n a v / r e p o r t s / S a l e s _ A d v a n c e _ L e t t e r _ C Z Z / 3 1 0 1 4 / " > - 
-     < B C R e p o r t I n f o r m a t i o n > - 
-         < R e p o r t M e t a d a t a > - 
-             < E x t e n s i o n I d > E x t e n s i o n   I D < / E x t e n s i o n I d > - 
-             < E x t e n s i o n N a m e > E x t e n s i o n   N a m e < / E x t e n s i o n N a m e > - 
-             < E x t e n s i o n P u b l i s h e r > E x t e n s i o n   P u b l i s h e r < / E x t e n s i o n P u b l i s h e r > - 
-             < E x t e n s i o n V e r s i o n > E x t e n s i o n   V e r s i o n < / E x t e n s i o n V e r s i o n > - 
-             < R e p o r t I d > R e p o r t   I D < / R e p o r t I d > - 
-             < R e p o r t N a m e > R e p o r t   N a m e < / R e p o r t N a m e > - 
-             < A b o u t T h i s R e p o r t T i t l e > A b o u t   T h i s   R e p o r t   T i t l e < / A b o u t T h i s R e p o r t T i t l e > - 
-             < A b o u t T h i s R e p o r t T e x t > A b o u t   T h i s   R e p o r t   T e x t < / A b o u t T h i s R e p o r t T e x t > - 
-             < R e p o r t H e l p L i n k > R e p o r t   H e l p   L i n k < / R e p o r t H e l p L i n k > - 
-         < / R e p o r t M e t a d a t a > - 
-         < R e p o r t R e q u e s t > - 
-             < T e n a n t E n t r a I d > T e n a n t   E n t r a   I d < / T e n a n t E n t r a I d > - 
-             < E n v i r o n m e n t N a m e > E n v i r o n m e n t   N a m e < / E n v i r o n m e n t N a m e > - 
-             < E n v i r o n m e n t T y p e > E n v i r o n m e n t   T y p e < / E n v i r o n m e n t T y p e > - 
-             < C o m p a n y N a m e > C o m p a n y   N a m e < / C o m p a n y N a m e > - 
-             < C o m p a n y D i s p l a y N a m e > C o m p a n y   D i s p l a y   N a m e < / C o m p a n y D i s p l a y N a m e > - 
-             < C o m p a n y I d > C o m p a n y   I D < / C o m p a n y I d > - 
-             < U s e r N a m e > U s e r   N a m e < / U s e r N a m e > - 
-             < D a t e A n d T i m e > D a t e   a n d   T i m e < / D a t e A n d T i m e > - 
-             < L a n g u a g e > L a n g u a g e < / L a n g u a g e > - 
-             < F o r m a t R e g i o n > F o r m a t   R e g i o n < / F o r m a t R e g i o n > - 
-             < D a t e T i m e V a l u e s > - 
-                 < Y e a r > Y e a r < / Y e a r > - 
-                 < M o n t h N u m b e r > M o n t h   N u m b e r < / M o n t h N u m b e r > - 
-                 < D a y N u m b e r > D a y   N u m b e r < / D a y N u m b e r > - 
-                 < H o u r > H o u r < / H o u r > - 
-                 < M i n u t e > M i n u t e < / M i n u t e > - 
-             < / D a t e T i m e V a l u e s > - 
-         < / R e p o r t R e q u e s t > - 
-     < / B C R e p o r t I n f o r m a t i o n > - 
-     < C o m p a n y _ I n f o r m a t i o n > - 
-         < C o m p a n y A d d r 1 > C o m p a n y A d d r 1 < / C o m p a n y A d d r 1 > - 
-         < C o m p a n y A d d r 2 > C o m p a n y A d d r 2 < / C o m p a n y A d d r 2 > - 
-         < C o m p a n y A d d r 3 > C o m p a n y A d d r 3 < / C o m p a n y A d d r 3 > - 
-         < C o m p a n y A d d r 4 > C o m p a n y A d d r 4 < / C o m p a n y A d d r 4 > - 
-         < C o m p a n y A d d r 5 > C o m p a n y A d d r 5 < / C o m p a n y A d d r 5 > - 
-         < C o m p a n y A d d r 6 > C o m p a n y A d d r 6 < / C o m p a n y A d d r 6 > - 
-         < H o m e P a g e _ C o m p a n y I n f o r m a t i o n > H o m e P a g e _ C o m p a n y I n f o r m a t i o n < / H o m e P a g e _ C o m p a n y I n f o r m a t i o n > - 
-         < P i c t u r e _ C o m p a n y I n f o r m a t i o n   / > - 
-         < R e g i s t r a t i o n N o _ C o m p a n y I n f o r m a t i o n > R e g i s t r a t i o n N o _ C o m p a n y I n f o r m a t i o n < / R e g i s t r a t i o n N o _ C o m p a n y I n f o r m a t i o n > - 
-         < V A T R e g i s t r a t i o n N o _ C o m p a n y I n f o r m a t i o n > V A T R e g i s t r a t i o n N o _ C o m p a n y I n f o r m a t i o n < / V A T R e g i s t r a t i o n N o _ C o m p a n y I n f o r m a t i o n > - 
-         < S a l e s _ _ x 0 0 2 6 _ _ R e c e i v a b l e s _ S e t u p > - 
-             < L o g o P o s i t i o n o n D o c u m e n t s _ S a l e s R e c e i v a b l e s S e t u p > L o g o P o s i t i o n o n D o c u m e n t s _ S a l e s R e c e i v a b l e s S e t u p < / L o g o P o s i t i o n o n D o c u m e n t s _ S a l e s R e c e i v a b l e s S e t u p > - 
-             < G e n e r a l _ L e d g e r _ S e t u p > - 
-                 < L C Y C o d e _ G e n e r a l L e d g e r S e t u p > L C Y C o d e _ G e n e r a l L e d g e r S e t u p < / L C Y C o d e _ G e n e r a l L e d g e r S e t u p > - 
-             < / G e n e r a l _ L e d g e r _ S e t u p > - 
-         < / S a l e s _ _ x 0 0 2 6 _ _ R e c e i v a b l e s _ S e t u p > - 
-     < / C o m p a n y _ I n f o r m a t i o n > - 
-     < S a l e s _ A d v a n c e _ L e t t e r _ H e a d e r > - 
-         < A d v a n c e D u e D a t e _ S a l e s A d v a n c L e t t e r H e a d e r > A d v a n c e D u e D a t e _ S a l e s A d v a n c L e t t e r H e a d e r < / A d v a n c e D u e D a t e _ S a l e s A d v a n c L e t t e r H e a d e r > - 
-         < A d v a n c e D u e D a t e _ S a l e s A d v a n c L e t t e r H e a d e r C a p t i o n > A d v a n c e D u e D a t e _ S a l e s A d v a n c L e t t e r H e a d e r C a p t i o n < / A d v a n c e D u e D a t e _ S a l e s A d v a n c L e t t e r H e a d e r C a p t i o n > - 
-         < A m o u n t I n c l u d i n g V A T > A m o u n t I n c l u d i n g V A T < / A m o u n t I n c l u d i n g V A T > - 
-         < A m o u n t I n c l u d i n g V A T L b l > A m o u n t I n c l u d i n g V A T L b l < / A m o u n t I n c l u d i n g V A T L b l > - 
-         < B a n k A c c o u n t N o _ S a l e s A d v a n c e L e t t e r H e a d e r > B a n k A c c o u n t N o _ S a l e s A d v a n c e L e t t e r H e a d e r < / B a n k A c c o u n t N o _ S a l e s A d v a n c e L e t t e r H e a d e r > - 
-         < B a n k A c c o u n t N o _ S a l e s A d v a n c e L e t t e r H e a d e r C a p t i o n > B a n k A c c o u n t N o _ S a l e s A d v a n c e L e t t e r H e a d e r C a p t i o n < / B a n k A c c o u n t N o _ S a l e s A d v a n c e L e t t e r H e a d e r C a p t i o n > - 
-         < B I C _ S a l e s A d v a n c e L e t t e r H e a d e r > B I C _ S a l e s A d v a n c e L e t t e r H e a d e r < / B I C _ S a l e s A d v a n c e L e t t e r H e a d e r > - 
-         < B I C _ S a l e s A d v a n c e L e t t e r H e a d e r C a p t i o n > B I C _ S a l e s A d v a n c e L e t t e r H e a d e r C a p t i o n < / B I C _ S a l e s A d v a n c e L e t t e r H e a d e r C a p t i o n > - 
-         < B o d y L b l > B o d y L b l < / B o d y L b l > - 
-         < C l o s i n g L b l > C l o s i n g L b l < / C l o s i n g L b l > - 
-         < C o m p a n y A d d r e s s 1 > C o m p a n y A d d r e s s 1 < / C o m p a n y A d d r e s s 1 > - 
-         < C o m p a n y A d d r e s s 2 > C o m p a n y A d d r e s s 2 < / C o m p a n y A d d r e s s 2 > - 
-         < C o m p a n y A d d r e s s 3 > C o m p a n y A d d r e s s 3 < / C o m p a n y A d d r e s s 3 > - 
-         < C o m p a n y A d d r e s s 4 > C o m p a n y A d d r e s s 4 < / C o m p a n y A d d r e s s 4 > - 
-         < C o m p a n y A d d r e s s 5 > C o m p a n y A d d r e s s 5 < / C o m p a n y A d d r e s s 5 > - 
-         < C o m p a n y A d d r e s s 6 > C o m p a n y A d d r e s s 6 < / C o m p a n y A d d r e s s 6 > - 
-         < C o p y L b l > C o p y L b l < / C o p y L b l > - 
-         < C r e a t o r L b l > C r e a t o r L b l < / C r e a t o r L b l > - 
-         < C u r r e n c y C o d e _ S a l e s A d v a n c e L e t t e r H e a d e r > C u r r e n c y C o d e _ S a l e s A d v a n c e L e t t e r H e a d e r < / C u r r e n c y C o d e _ S a l e s A d v a n c e L e t t e r H e a d e r > - 
-         < C u s t A d d r 1 > C u s t A d d r 1 < / C u s t A d d r 1 > - 
-         < C u s t A d d r 2 > C u s t A d d r 2 < / C u s t A d d r 2 > - 
-         < C u s t A d d r 3 > C u s t A d d r 3 < / C u s t A d d r 3 > - 
-         < C u s t A d d r 4 > C u s t A d d r 4 < / C u s t A d d r 4 > - 
-         < C u s t A d d r 5 > C u s t A d d r 5 < / C u s t A d d r 5 > - 
-         < C u s t A d d r 6 > C u s t A d d r 6 < / C u s t A d d r 6 > - 
-         < C u s t L b l > C u s t L b l < / C u s t L b l > - 
-         < D o c F o o t e r T e x t > D o c F o o t e r T e x t < / D o c F o o t e r T e x t > - 
-         < D o c u m e n t D a t e _ S a l e s A d v a n c e L e t t e r H e a d e r > D o c u m e n t D a t e _ S a l e s A d v a n c e L e t t e r H e a d e r < / D o c u m e n t D a t e _ S a l e s A d v a n c e L e t t e r H e a d e r > - 
-         < D o c u m e n t D a t e _ S a l e s A d v a n c e L e t t e r H e a d e r C a p t i o n > D o c u m e n t D a t e _ S a l e s A d v a n c e L e t t e r H e a d e r C a p t i o n < / D o c u m e n t D a t e _ S a l e s A d v a n c e L e t t e r H e a d e r C a p t i o n > - 
-         < D o c u m e n t L b l > D o c u m e n t L b l < / D o c u m e n t L b l > - 
-         < D o c u m e n t N o L b l > D o c u m e n t N o L b l < / D o c u m e n t N o L b l > - 
-         < F o r m a t t e d _ A m o u n t I n c l u d i n g V A T > F o r m a t t e d _ A m o u n t I n c l u d i n g V A T < / F o r m a t t e d _ A m o u n t I n c l u d i n g V A T > - 
-         < G r e e t i n g L b l > G r e e t i n g L b l < / G r e e t i n g L b l > - 
-         < I B A N _ S a l e s A d v a n c e L e t t e r H e a d e r > I B A N _ S a l e s A d v a n c e L e t t e r H e a d e r < / I B A N _ S a l e s A d v a n c e L e t t e r H e a d e r > - 
-         < I B A N _ S a l e s A d v a n c e L e t t e r H e a d e r C a p t i o n > I B A N _ S a l e s A d v a n c e L e t t e r H e a d e r C a p t i o n < / I B A N _ S a l e s A d v a n c e L e t t e r H e a d e r C a p t i o n > - 
-         < N o _ S a l e s A d v a n c e L e t t e r H e a d e r > N o _ S a l e s A d v a n c e L e t t e r H e a d e r < / N o _ S a l e s A d v a n c e L e t t e r H e a d e r > - 
-         < P a g e L b l > P a g e L b l < / P a g e L b l > - 
-         < P a y m e n t M e t h o d > P a y m e n t M e t h o d < / P a y m e n t M e t h o d > - 
-         < P a y m e n t M e t h o d L b l > P a y m e n t M e t h o d L b l < / P a y m e n t M e t h o d L b l > - 
-         < P a y m e n t T e r m s > P a y m e n t T e r m s < / P a y m e n t T e r m s > - 
-         < P a y m e n t T e r m s L b l > P a y m e n t T e r m s L b l < / P a y m e n t T e r m s L b l > - 
-         < P m n t S y m b o l 1 > P m n t S y m b o l 1 < / P m n t S y m b o l 1 > - 
-         < P m n t S y m b o l 2 > P m n t S y m b o l 2 < / P m n t S y m b o l 2 > - 
-         < P m n t S y m b o l 3 > P m n t S y m b o l 3 < / P m n t S y m b o l 3 > - 
-         < P m n t S y m b o l 4 > P m n t S y m b o l 4 < / P m n t S y m b o l 4 > - 
-         < Q R P a y m e n t C o d e > Q R P a y m e n t C o d e < / Q R P a y m e n t C o d e > - 
-         < Q R P a y m e n t L b l > Q R P a y m e n t L b l < / Q R P a y m e n t L b l > - 
-         < R e g i s t r a t i o n N o _ S a l e s A d v a n c e L e t t e r H e a d e r > R e g i s t r a t i o n N o _ S a l e s A d v a n c e L e t t e r H e a d e r < / R e g i s t r a t i o n N o _ S a l e s A d v a n c e L e t t e r H e a d e r > - 
-         < R e g i s t r a t i o n N o _ S a l e s A d v a n c e L e t t e r H e a d e r C a p t i o n > R e g i s t r a t i o n N o _ S a l e s A d v a n c e L e t t e r H e a d e r C a p t i o n < / R e g i s t r a t i o n N o _ S a l e s A d v a n c e L e t t e r H e a d e r C a p t i o n > - 
-         < S a l e s p e r s o n L b l > S a l e s p e r s o n L b l < / S a l e s p e r s o n L b l > - 
-         < T o t a l L b l > T o t a l L b l < / T o t a l L b l > - 
-         < V A T R e g i s t r a t i o n N o _ S a l e s A d v a n c e L e t t e r H e a d e r > V A T R e g i s t r a t i o n N o _ S a l e s A d v a n c e L e t t e r H e a d e r < / V A T R e g i s t r a t i o n N o _ S a l e s A d v a n c e L e t t e r H e a d e r > - 
-         < V A T R e g i s t r a t i o n N o _ S a l e s A d v a n c e L e t t e r H e a d e r C a p t i o n > V A T R e g i s t r a t i o n N o _ S a l e s A d v a n c e L e t t e r H e a d e r C a p t i o n < / V A T R e g i s t r a t i o n N o _ S a l e s A d v a n c e L e t t e r H e a d e r C a p t i o n > - 
-         < V e n d L b l > V e n d L b l < / V e n d L b l > - 
-         < Y o u r R e f e r e n c e _ S a l e s A d v a n c e L e t t e r H e a d e r > Y o u r R e f e r e n c e _ S a l e s A d v a n c e L e t t e r H e a d e r < / Y o u r R e f e r e n c e _ S a l e s A d v a n c e L e t t e r H e a d e r > - 
-         < Y o u r R e f e r e n c e _ S a l e s A d v a n c e L e t t e r H e a d e r C a p t i o n > Y o u r R e f e r e n c e _ S a l e s A d v a n c e L e t t e r H e a d e r C a p t i o n < / Y o u r R e f e r e n c e _ S a l e s A d v a n c e L e t t e r H e a d e r C a p t i o n > - 
-         < C o p y L o o p > - 
-             < C o p y N o > C o p y N o < / C o p y N o > - 
-             < S a l e s p e r s o n _ P u r c h a s e r > - 
-                 < E M a i l _ S a l e s p e r s o n P u r c h a s e r > E M a i l _ S a l e s p e r s o n P u r c h a s e r < / E M a i l _ S a l e s p e r s o n P u r c h a s e r > - 
-                 < N a m e _ S a l e s p e r s o n P u r c h a s e r > N a m e _ S a l e s p e r s o n P u r c h a s e r < / N a m e _ S a l e s p e r s o n P u r c h a s e r > - 
-                 < P h o n e N o _ S a l e s p e r s o n P u r c h a s e r > P h o n e N o _ S a l e s p e r s o n P u r c h a s e r < / P h o n e N o _ S a l e s p e r s o n P u r c h a s e r > - 
-             < / S a l e s p e r s o n _ P u r c h a s e r > - 
-             < S a l e s _ A d v a n c e _ L e t t e r _ L i n e > - 
-                 < A m o u n t I n c l u d i n g V A T _ S a l e s A d v a n c e L e t t e r L i n e > A m o u n t I n c l u d i n g V A T _ S a l e s A d v a n c e L e t t e r L i n e < / A m o u n t I n c l u d i n g V A T _ S a l e s A d v a n c e L e t t e r L i n e > - 
-                 < A m o u n t I n c l u d i n g V A T _ S a l e s A d v a n c e L e t t e r L i n e C a p t i o n > A m o u n t I n c l u d i n g V A T _ S a l e s A d v a n c e L e t t e r L i n e C a p t i o n < / A m o u n t I n c l u d i n g V A T _ S a l e s A d v a n c e L e t t e r L i n e C a p t i o n > - 
-                 < D e s c r i p t i o n _ S a l e s A d v a n c e L e t t e r L i n e > D e s c r i p t i o n _ S a l e s A d v a n c e L e t t e r L i n e < / D e s c r i p t i o n _ S a l e s A d v a n c e L e t t e r L i n e > - 
-                 < D e s c r i p t i o n _ S a l e s A d v a n c e L e t t e r L i n e C a p t i o n > D e s c r i p t i o n _ S a l e s A d v a n c e L e t t e r L i n e C a p t i o n < / D e s c r i p t i o n _ S a l e s A d v a n c e L e t t e r L i n e C a p t i o n > - 
-                 < F o r m a t t e d _ A m o u n t I n c l u d i n g V A T _ S a l e s A d v a n c e L e t t e r L i n e > F o r m a t t e d _ A m o u n t I n c l u d i n g V A T _ S a l e s A d v a n c e L e t t e r L i n e < / F o r m a t t e d _ A m o u n t I n c l u d i n g V A T _ S a l e s A d v a n c e L e t t e r L i n e > - 
-                 < L i n e N o _ S a l e s A d v a n c e L e t t e r L i n e > L i n e N o _ S a l e s A d v a n c e L e t t e r L i n e < / L i n e N o _ S a l e s A d v a n c e L e t t e r L i n e > - 
-                 < V A T _ S a l e s A d v a n c e L e t t e r L i n e > V A T _ S a l e s A d v a n c e L e t t e r L i n e < / V A T _ S a l e s A d v a n c e L e t t e r L i n e > - 
-                 < V A T _ S a l e s A d v a n c e L e t t e r L i n e C a p t i o n > V A T _ S a l e s A d v a n c e L e t t e r L i n e C a p t i o n < / V A T _ S a l e s A d v a n c e L e t t e r L i n e C a p t i o n > - 
-             < / S a l e s _ A d v a n c e _ L e t t e r _ L i n e > - 
-             < U s e r _ S e t u p > - 
-                 < E m p l o y e e > - 
-                     < C o m p a n y E M a i l _ E m p l o y e e > C o m p a n y E M a i l _ E m p l o y e e < / C o m p a n y E M a i l _ E m p l o y e e > - 
-                     < F u l l N a m e _ E m p l o y e e > F u l l N a m e _ E m p l o y e e < / F u l l N a m e _ E m p l o y e e > - 
-                     < P h o n e N o _ E m p l o y e e > P h o n e N o _ E m p l o y e e < / P h o n e N o _ E m p l o y e e > - 
-                 < / E m p l o y e e > - 
-             < / U s e r _ S e t u p > - 
-         < / C o p y L o o p > - 
-     < / S a l e s _ A d v a n c e _ L e t t e r _ H e a d e r > - 
- < / N a v W o r d R e p o r t X m l P a r t > 
+<file path=customXml/item1.xml><?xml version="1.0" encoding="utf-8"?>
+<NavWordReportXmlPart xmlns="urn:microsoft-dynamics-nav/reports/Sales_Advance_Letter_CZZ/31014/">
+  <BCReportInformation>
+    <ReportMetadata>
+      <ExtensionId>Extension ID</ExtensionId>
+      <ExtensionName>Extension Name</ExtensionName>
+      <ExtensionPublisher>Extension Publisher</ExtensionPublisher>
+      <ExtensionVersion>Extension Version</ExtensionVersion>
+      <ReportId>Report ID</ReportId>
+      <ReportName>Report Name</ReportName>
+      <AboutThisReportTitle>About This Report Title</AboutThisReportTitle>
+      <AboutThisReportText>About This Report Text</AboutThisReportText>
+      <ReportHelpLink>Report Help Link</ReportHelpLink>
+      <ReportCaption>Report Caption</ReportCaption>
+    </ReportMetadata>
+    <ReportRequest>
+      <TenantEntraId>Tenant Entra Id</TenantEntraId>
+      <EnvironmentName>Environment Name</EnvironmentName>
+      <EnvironmentType>Environment Type</EnvironmentType>
+      <CompanyName>Company Name</CompanyName>
+      <CompanyDisplayName>Company Display Name</CompanyDisplayName>
+      <CompanyId>Company ID</CompanyId>
+      <UserName>User Name</UserName>
+      <DateAndTime>Date and Time</DateAndTime>
+      <Language>Language</Language>
+      <FormatRegion>Format Region</FormatRegion>
+      <DateTimeValues>
+        <Year>Year</Year>
+        <MonthNumber>Month Number</MonthNumber>
+        <DayNumber>Day Number</DayNumber>
+        <Hour>Hour</Hour>
+        <Minute>Minute</Minute>
+      </DateTimeValues>
+    </ReportRequest>
+    <CompanyMetadata>
+      <CompanyName>Company Name</CompanyName>
+      <CompanyDisplayName>Company Display Name</CompanyDisplayName>
+      <CompanyAddressLines>
+        <CompanyAddressLine1>Company Address Line 1</CompanyAddressLine1>
+        <CompanyAddressLine2>Company Address Line 2</CompanyAddressLine2>
+        <CompanyAddressLine3>Company Address Line 3</CompanyAddressLine3>
+        <CompanyAddressLine4>Company Address Line 4</CompanyAddressLine4>
+        <CompanyAddressLine5>Company Address Line 5</CompanyAddressLine5>
+        <CompanyAddressLine6>Company Address Line 6</CompanyAddressLine6>
+        <CompanyAddressLine7>Company Address Line 7</CompanyAddressLine7>
+        <CompanyAddressLine8>Company Address Line 8</CompanyAddressLine8>
+      </CompanyAddressLines>
+      <CompanyPhone>Company Phone</CompanyPhone>
+      <CompanyPhoneCaption>Company Phone Caption</CompanyPhoneCaption>
+      <CompanyFaxNo>Company Fax No.</CompanyFaxNo>
+      <CompanyFaxNoCaption>Company Fax No. Caption</CompanyFaxNoCaption>
+      <CompanyEmail>Company Email</CompanyEmail>
+      <CompanyEmailCaption>Company Email Caption</CompanyEmailCaption>
+      <CompanyHomePage>Company Home Page</CompanyHomePage>
+      <CompanyHomePageCaption>Company Home Page Caption</CompanyHomePageCaption>
+      <CompanyLogo>Company Logo</CompanyLogo>
+      <CompanyVATRegistrationNo>Company VAT Registration No.</CompanyVATRegistrationNo>
+      <CompanyVATRegistrationNoCaption>Company VAT Registration No. Caption</CompanyVATRegistrationNoCaption>
+      <CompanyRegistrationNo>Company Registration No.</CompanyRegistrationNo>
+      <CompanyRegistrationNoCaption>Company Registration No. Caption</CompanyRegistrationNoCaption>
+      <CompanyBankName>Company Bank Name</CompanyBankName>
+      <CompanyBankNameCaption>Company Bank Name Caption</CompanyBankNameCaption>
+      <CompanyBankAccountNo>Company Bank Account No.</CompanyBankAccountNo>
+      <CompanyBankAccountNoCaption>Company Bank Account No. Caption</CompanyBankAccountNoCaption>
+      <CompanyBankBranchNo>Company Bank Branch No.</CompanyBankBranchNo>
+      <CompanyBankBranchNoCaption>Company Bank Branch No. Caption</CompanyBankBranchNoCaption>
+      <CompanyIBAN>Company IBAN</CompanyIBAN>
+      <CompanyIBANCaption>Company IBAN Caption</CompanyIBANCaption>
+      <CompanyBankSWIFT>Company Bank SWIFT</CompanyBankSWIFT>
+      <CompanyBankSWIFTCaption>Company Bank SWIFT Caption</CompanyBankSWIFTCaption>
+      <CompanyGiroNo>Company Giro No.</CompanyGiroNo>
+      <CompanyGiroNoCaption>Company Giro No. Caption</CompanyGiroNoCaption>
+    </CompanyMetadata>
+  </BCReportInformation>
+  <Company_Information>
+    <CompanyAddr1>CompanyAddr1</CompanyAddr1>
+    <CompanyAddr2>CompanyAddr2</CompanyAddr2>
+    <CompanyAddr3>CompanyAddr3</CompanyAddr3>
+    <CompanyAddr4>CompanyAddr4</CompanyAddr4>
+    <CompanyAddr5>CompanyAddr5</CompanyAddr5>
+    <CompanyAddr6>CompanyAddr6</CompanyAddr6>
+    <HomePage_CompanyInformation>HomePage_CompanyInformation</HomePage_CompanyInformation>
+    <Picture_CompanyInformation/>
+    <RegistrationNo_CompanyInformation>RegistrationNo_CompanyInformation</RegistrationNo_CompanyInformation>
+    <VATRegistrationNo_CompanyInformation>VATRegistrationNo_CompanyInformation</VATRegistrationNo_CompanyInformation>
+    <Sales__x0026__Receivables_Setup>
+      <LogoPositiononDocuments_SalesReceivablesSetup>LogoPositiononDocuments_SalesReceivablesSetup</LogoPositiononDocuments_SalesReceivablesSetup>
+      <General_Ledger_Setup>
+        <LCYCode_GeneralLedgerSetup>LCYCode_GeneralLedgerSetup</LCYCode_GeneralLedgerSetup>
+      </General_Ledger_Setup>
+    </Sales__x0026__Receivables_Setup>
+  </Company_Information>
+  <Sales_Advance_Letter_Header>
+    <AdvanceDueDate_SalesAdvancLetterHeader>AdvanceDueDate_SalesAdvancLetterHeader</AdvanceDueDate_SalesAdvancLetterHeader>
+    <AdvanceDueDate_SalesAdvancLetterHeaderCaption>AdvanceDueDate_SalesAdvancLetterHeaderCaption</AdvanceDueDate_SalesAdvancLetterHeaderCaption>
+    <AmountIncludingVAT>AmountIncludingVAT</AmountIncludingVAT>
+    <AmountIncludingVATLbl>AmountIncludingVATLbl</AmountIncludingVATLbl>
+    <BankAccountNo_SalesAdvanceLetterHeader>BankAccountNo_SalesAdvanceLetterHeader</BankAccountNo_SalesAdvanceLetterHeader>
+    <BankAccountNo_SalesAdvanceLetterHeaderCaption>BankAccountNo_SalesAdvanceLetterHeaderCaption</BankAccountNo_SalesAdvanceLetterHeaderCaption>
+    <BIC_SalesAdvanceLetterHeader>BIC_SalesAdvanceLetterHeader</BIC_SalesAdvanceLetterHeader>
+    <BIC_SalesAdvanceLetterHeaderCaption>BIC_SalesAdvanceLetterHeaderCaption</BIC_SalesAdvanceLetterHeaderCaption>
+    <BodyLbl>BodyLbl</BodyLbl>
+    <ClosingLbl>ClosingLbl</ClosingLbl>
+    <CompanyAddress1>CompanyAddress1</CompanyAddress1>
+    <CompanyAddress2>CompanyAddress2</CompanyAddress2>
+    <CompanyAddress3>CompanyAddress3</CompanyAddress3>
+    <CompanyAddress4>CompanyAddress4</CompanyAddress4>
+    <CompanyAddress5>CompanyAddress5</CompanyAddress5>
+    <CompanyAddress6>CompanyAddress6</CompanyAddress6>
+    <CopyLbl>CopyLbl</CopyLbl>
+    <CreatorLbl>CreatorLbl</CreatorLbl>
+    <CurrencyCode_SalesAdvanceLetterHeader>CurrencyCode_SalesAdvanceLetterHeader</CurrencyCode_SalesAdvanceLetterHeader>
+    <CustAddr1>CustAddr1</CustAddr1>
+    <CustAddr2>CustAddr2</CustAddr2>
+    <CustAddr3>CustAddr3</CustAddr3>
+    <CustAddr4>CustAddr4</CustAddr4>
+    <CustAddr5>CustAddr5</CustAddr5>
+    <CustAddr6>CustAddr6</CustAddr6>
+    <CustLbl>CustLbl</CustLbl>
+    <DocFooterText>DocFooterText</DocFooterText>
+    <DocumentDate_SalesAdvanceLetterHeader>DocumentDate_SalesAdvanceLetterHeader</DocumentDate_SalesAdvanceLetterHeader>
+    <DocumentDate_SalesAdvanceLetterHeaderCaption>DocumentDate_SalesAdvanceLetterHeaderCaption</DocumentDate_SalesAdvanceLetterHeaderCaption>
+    <DocumentLbl>DocumentLbl</DocumentLbl>
+    <DocumentNoLbl>DocumentNoLbl</DocumentNoLbl>
+    <Formatted_AmountIncludingVAT>Formatted_AmountIncludingVAT</Formatted_AmountIncludingVAT>
+    <GreetingLbl>GreetingLbl</GreetingLbl>
+    <IBAN_SalesAdvanceLetterHeader>IBAN_SalesAdvanceLetterHeader</IBAN_SalesAdvanceLetterHeader>
+    <IBAN_SalesAdvanceLetterHeaderCaption>IBAN_SalesAdvanceLetterHeaderCaption</IBAN_SalesAdvanceLetterHeaderCaption>
+    <No_SalesAdvanceLetterHeader>No_SalesAdvanceLetterHeader</No_SalesAdvanceLetterHeader>
+    <PageLbl>PageLbl</PageLbl>
+    <PaymentMethod>PaymentMethod</PaymentMethod>
+    <PaymentMethodLbl>PaymentMethodLbl</PaymentMethodLbl>
+    <PaymentTerms>PaymentTerms</PaymentTerms>
+    <PaymentTermsLbl>PaymentTermsLbl</PaymentTermsLbl>
+    <PmntSymbol1>PmntSymbol1</PmntSymbol1>
+    <PmntSymbol2>PmntSymbol2</PmntSymbol2>
+    <PmntSymbol3>PmntSymbol3</PmntSymbol3>
+    <PmntSymbol4>PmntSymbol4</PmntSymbol4>
+    <QRPaymentCode>QRPaymentCode</QRPaymentCode>
+    <QRPaymentLbl>QRPaymentLbl</QRPaymentLbl>
+    <RegistrationNo_SalesAdvanceLetterHeader>RegistrationNo_SalesAdvanceLetterHeader</RegistrationNo_SalesAdvanceLetterHeader>
+    <RegistrationNo_SalesAdvanceLetterHeaderCaption>RegistrationNo_SalesAdvanceLetterHeaderCaption</RegistrationNo_SalesAdvanceLetterHeaderCaption>
+    <SalespersonLbl>SalespersonLbl</SalespersonLbl>
+    <TotalLbl>TotalLbl</TotalLbl>
+    <VATRegistrationNo_SalesAdvanceLetterHeader>VATRegistrationNo_SalesAdvanceLetterHeader</VATRegistrationNo_SalesAdvanceLetterHeader>
+    <VATRegistrationNo_SalesAdvanceLetterHeaderCaption>VATRegistrationNo_SalesAdvanceLetterHeaderCaption</VATRegistrationNo_SalesAdvanceLetterHeaderCaption>
+    <VendLbl>VendLbl</VendLbl>
+    <YourReference_SalesAdvanceLetterHeader>YourReference_SalesAdvanceLetterHeader</YourReference_SalesAdvanceLetterHeader>
+    <YourReference_SalesAdvanceLetterHeaderCaption>YourReference_SalesAdvanceLetterHeaderCaption</YourReference_SalesAdvanceLetterHeaderCaption>
+    <CopyLoop>
+      <CopyNo>CopyNo</CopyNo>
+      <Salesperson_Purchaser>
+        <EMail_SalespersonPurchaser>EMail_SalespersonPurchaser</EMail_SalespersonPurchaser>
+        <Name_SalespersonPurchaser>Name_SalespersonPurchaser</Name_SalespersonPurchaser>
+        <PhoneNo_SalespersonPurchaser>PhoneNo_SalespersonPurchaser</PhoneNo_SalespersonPurchaser>
+      </Salesperson_Purchaser>
+      <Sales_Advance_Letter_Line>
+        <AmountIncludingVAT_SalesAdvanceLetterLine>AmountIncludingVAT_SalesAdvanceLetterLine</AmountIncludingVAT_SalesAdvanceLetterLine>
+        <AmountIncludingVAT_SalesAdvanceLetterLineCaption>AmountIncludingVAT_SalesAdvanceLetterLineCaption</AmountIncludingVAT_SalesAdvanceLetterLineCaption>
+        <Description_SalesAdvanceLetterLine>Description_SalesAdvanceLetterLine</Description_SalesAdvanceLetterLine>
+        <Description_SalesAdvanceLetterLineCaption>Description_SalesAdvanceLetterLineCaption</Description_SalesAdvanceLetterLineCaption>
+        <Formatted_AmountIncludingVAT_SalesAdvanceLetterLine>Formatted_AmountIncludingVAT_SalesAdvanceLetterLine</Formatted_AmountIncludingVAT_SalesAdvanceLetterLine>
+        <LineNo_SalesAdvanceLetterLine>LineNo_SalesAdvanceLetterLine</LineNo_SalesAdvanceLetterLine>
+        <VAT_SalesAdvanceLetterLine>VAT_SalesAdvanceLetterLine</VAT_SalesAdvanceLetterLine>
+        <VAT_SalesAdvanceLetterLineCaption>VAT_SalesAdvanceLetterLineCaption</VAT_SalesAdvanceLetterLineCaption>
+      </Sales_Advance_Letter_Line>
+      <User_Setup>
+        <Employee>
+          <CompanyEMail_Employee>CompanyEMail_Employee</CompanyEMail_Employee>
+          <FullName_Employee>FullName_Employee</FullName_Employee>
+          <PhoneNo_Employee>PhoneNo_Employee</PhoneNo_Employee>
+        </Employee>
+      </User_Setup>
+    </CopyLoop>
+  </Sales_Advance_Letter_Header>
+</NavWordReportXmlPart>
 </file>
 
 <file path=customXml/item2.xml>��< ? x m l   v e r s i o n = " 1 . 0 "   e n c o d i n g = " u t f - 1 6 " ? > 
</xml_diff>